<commit_message>
fix(templates): replace hardcoded March dates with weekly date variables in celsis and 71 templates
</commit_message>
<xml_diff>
--- a/tables for 71.docx
+++ b/tables for 71.docx
@@ -6168,7 +6168,7 @@
                 <w:sz w:val="14"/>
                 <w:szCs w:val="14"/>
               </w:rPr>
-              <w:t xml:space="preserve">12MAR 2026 </w:t>
+              <w:t xml:space="preserve">{{ date_of_weekly }} </w:t>
             </w:r>
           </w:p>
         </w:tc>
@@ -6499,7 +6499,7 @@
                 <w:sz w:val="14"/>
                 <w:szCs w:val="14"/>
               </w:rPr>
-              <w:t xml:space="preserve"> 27MAR2026</w:t>
+              <w:t xml:space="preserve"> {{ date_of_weekly }}</w:t>
             </w:r>
           </w:p>
         </w:tc>

</xml_diff>

<commit_message>
fix(tables): align Table 1 width/margins with Table 2, fix Datel typo in header, use 31Aug2026 titlecase date
</commit_message>
<xml_diff>
--- a/tables for 71.docx
+++ b/tables for 71.docx
@@ -827,42 +827,8 @@
             <w:vAlign w:val="center"/>
           </w:tcPr>
           <w:p>
-            <w:proofErr w:type="spellStart"/>
-            <w:r>
-              <w:rPr>
-                <w:rFonts w:ascii="Times New Roman" w:hAnsi="Times New Roman"/>
-                <w:b/>
-                <w:bCs/>
-                <w:color w:val="000000" w:themeColor="text1"/>
-                <w:sz w:val="12"/>
-                <w:szCs w:val="12"/>
-              </w:rPr>
-              <w:t>Datel</w:t>
-            </w:r>
-            <w:proofErr w:type="spellEnd"/>
-            <w:r>
-              <w:rPr>
-                <w:rFonts w:ascii="Times New Roman" w:hAnsi="Times New Roman"/>
-                <w:b/>
-                <w:bCs/>
-                <w:color w:val="000000" w:themeColor="text1"/>
-                <w:sz w:val="12"/>
-                <w:szCs w:val="12"/>
-              </w:rPr>
-              <w:t xml:space="preserve"> (DDMM</w:t>
-            </w:r>
-          </w:p>
-          <w:p>
-            <w:r>
-              <w:rPr>
-                <w:rFonts w:ascii="Times New Roman" w:hAnsi="Times New Roman"/>
-                <w:b/>
-                <w:bCs/>
-                <w:color w:val="000000" w:themeColor="text1"/>
-                <w:sz w:val="12"/>
-                <w:szCs w:val="12"/>
-              </w:rPr>
-              <w:t>YY)</w:t>
+            <w:r>
+              <w:t>Date</w:t>
             </w:r>
           </w:p>
         </w:tc>

</xml_diff>

<commit_message>
fix(templates): set Date (DDMMMYY) and Analyst (Initials) in Times New Roman 12pt bold
</commit_message>
<xml_diff>
--- a/tables for 71.docx
+++ b/tables for 71.docx
@@ -828,7 +828,15 @@
           </w:tcPr>
           <w:p>
             <w:r>
-              <w:t>Date</w:t>
+              <w:rPr>
+                <w:rFonts w:ascii="Times New Roman" w:hAnsi="Times New Roman"/>
+                <w:b/>
+                <w:bCs/>
+                <w:color w:val="000000" w:themeColor="text1"/>
+                <w:sz w:val="12"/>
+                <w:szCs w:val="12"/>
+              </w:rPr>
+              <w:t>Date (DDMMMYY)</w:t>
             </w:r>
           </w:p>
         </w:tc>

</xml_diff>

<commit_message>
fix(tables): center headers and Date column, enforce DDMMMYY format (01Sep26)
</commit_message>
<xml_diff>
--- a/tables for 71.docx
+++ b/tables for 71.docx
@@ -766,6 +766,9 @@
             <w:vAlign w:val="center"/>
           </w:tcPr>
           <w:p>
+            <w:pPr>
+              <w:jc w:val="center"/>
+            </w:pPr>
             <w:r>
               <w:rPr>
                 <w:rFonts w:ascii="Times New Roman" w:hAnsi="Times New Roman"/>
@@ -797,6 +800,9 @@
             <w:vAlign w:val="center"/>
           </w:tcPr>
           <w:p>
+            <w:pPr>
+              <w:jc w:val="center"/>
+            </w:pPr>
             <w:r>
               <w:rPr>
                 <w:rFonts w:ascii="Times New Roman" w:hAnsi="Times New Roman"/>
@@ -827,6 +833,9 @@
             <w:vAlign w:val="center"/>
           </w:tcPr>
           <w:p>
+            <w:pPr>
+              <w:jc w:val="center"/>
+            </w:pPr>
             <w:r>
               <w:rPr>
                 <w:rFonts w:ascii="Times New Roman" w:hAnsi="Times New Roman"/>
@@ -858,6 +867,9 @@
             <w:vAlign w:val="center"/>
           </w:tcPr>
           <w:p>
+            <w:pPr>
+              <w:jc w:val="center"/>
+            </w:pPr>
             <w:r>
               <w:rPr>
                 <w:rFonts w:ascii="Times New Roman" w:hAnsi="Times New Roman"/>
@@ -888,6 +900,9 @@
             <w:vAlign w:val="center"/>
           </w:tcPr>
           <w:p>
+            <w:pPr>
+              <w:jc w:val="center"/>
+            </w:pPr>
             <w:r>
               <w:rPr>
                 <w:rFonts w:ascii="Times New Roman" w:hAnsi="Times New Roman"/>
@@ -919,6 +934,9 @@
             <w:vAlign w:val="center"/>
           </w:tcPr>
           <w:p>
+            <w:pPr>
+              <w:jc w:val="center"/>
+            </w:pPr>
             <w:r>
               <w:rPr>
                 <w:rFonts w:ascii="Times New Roman" w:hAnsi="Times New Roman"/>
@@ -949,6 +967,9 @@
             <w:vAlign w:val="center"/>
           </w:tcPr>
           <w:p>
+            <w:pPr>
+              <w:jc w:val="center"/>
+            </w:pPr>
             <w:r>
               <w:rPr>
                 <w:rFonts w:ascii="Times New Roman" w:hAnsi="Times New Roman"/>
@@ -979,6 +1000,9 @@
             <w:vAlign w:val="center"/>
           </w:tcPr>
           <w:p>
+            <w:pPr>
+              <w:jc w:val="center"/>
+            </w:pPr>
             <w:r>
               <w:rPr>
                 <w:rFonts w:ascii="Times New Roman" w:hAnsi="Times New Roman"/>
@@ -1010,6 +1034,9 @@
             <w:vAlign w:val="center"/>
           </w:tcPr>
           <w:p>
+            <w:pPr>
+              <w:jc w:val="center"/>
+            </w:pPr>
             <w:r>
               <w:rPr>
                 <w:rFonts w:ascii="Times New Roman" w:hAnsi="Times New Roman"/>
@@ -1151,6 +1178,7 @@
                 <w:sz w:val="14"/>
                 <w:szCs w:val="14"/>
               </w:rPr>
+              <w:jc w:val="center"/>
             </w:pPr>
             <w:r>
               <w:rPr>

</xml_diff>

<commit_message>
feat(tables): simplify weekly EM to single 'Week on Testing Date' row for Active Air and Surface
</commit_message>
<xml_diff>
--- a/tables for 71.docx
+++ b/tables for 71.docx
@@ -5368,7 +5368,7 @@
               <w:top w:val="single" w:sz="8" w:space="0" w:color="auto"/>
               <w:left w:val="single" w:sz="8" w:space="0" w:color="auto"/>
               <w:bottom w:val="single" w:sz="8" w:space="0" w:color="auto"/>
-              <w:right w:val="single" w:sz="8" w:space="0" w:color="000000" w:themeColor="text1"/>
+              <w:right w:val="single" w:sz="8" w:space="0" w:color="auto"/>
             </w:tcBorders>
             <w:vAlign w:val="center"/>
           </w:tcPr>
@@ -5391,7 +5391,7 @@
           <w:tcPr>
             <w:tcW w:w="652" w:type="dxa"/>
             <w:tcBorders>
-              <w:top w:val="nil"/>
+              <w:top w:val="single" w:sz="8" w:space="0" w:color="auto"/>
               <w:left w:val="nil"/>
               <w:bottom w:val="single" w:sz="8" w:space="0" w:color="auto"/>
               <w:right w:val="single" w:sz="8" w:space="0" w:color="auto"/>
@@ -5417,7 +5417,7 @@
           <w:tcPr>
             <w:tcW w:w="1129" w:type="dxa"/>
             <w:tcBorders>
-              <w:top w:val="nil"/>
+              <w:top w:val="single" w:sz="8" w:space="0" w:color="auto"/>
               <w:left w:val="single" w:sz="8" w:space="0" w:color="auto"/>
               <w:bottom w:val="single" w:sz="8" w:space="0" w:color="auto"/>
               <w:right w:val="single" w:sz="8" w:space="0" w:color="auto"/>
@@ -5469,29 +5469,24 @@
           <w:tcPr>
             <w:tcW w:w="999" w:type="dxa"/>
             <w:tcBorders>
-              <w:top w:val="nil"/>
-              <w:left w:val="single" w:sz="8" w:space="0" w:color="auto"/>
-              <w:bottom w:val="single" w:sz="8" w:space="0" w:color="auto"/>
-              <w:right w:val="single" w:sz="8" w:space="0" w:color="auto"/>
-            </w:tcBorders>
-            <w:vAlign w:val="center"/>
-          </w:tcPr>
-          <w:p>
-            <w:pPr>
-              <w:jc w:val="center"/>
-              <w:rPr>
-                <w:rFonts w:ascii="Times New Roman" w:hAnsi="Times New Roman"/>
-                <w:sz w:val="14"/>
-                <w:szCs w:val="14"/>
-              </w:rPr>
-            </w:pPr>
-            <w:r>
-              <w:rPr>
-                <w:rFonts w:ascii="Times New Roman" w:hAnsi="Times New Roman"/>
-                <w:sz w:val="14"/>
-                <w:szCs w:val="14"/>
-              </w:rPr>
-              <w:t xml:space="preserve">SMO </w:t>
+              <w:top w:val="single" w:sz="8" w:space="0" w:color="auto"/>
+              <w:left w:val="single" w:sz="8" w:space="0" w:color="auto"/>
+              <w:bottom w:val="single" w:sz="8" w:space="0" w:color="auto"/>
+              <w:right w:val="single" w:sz="8" w:space="0" w:color="auto"/>
+            </w:tcBorders>
+            <w:vAlign w:val="center"/>
+          </w:tcPr>
+          <w:p>
+            <w:pPr>
+              <w:jc w:val="center"/>
+            </w:pPr>
+            <w:r>
+              <w:rPr>
+                <w:rFonts w:ascii="Times New Roman" w:hAnsi="Times New Roman"/>
+                <w:sz w:val="14"/>
+                <w:szCs w:val="14"/>
+              </w:rPr>
+              <w:t xml:space="preserve"> SMO</w:t>
             </w:r>
           </w:p>
         </w:tc>
@@ -5500,25 +5495,25 @@
             <w:tcW w:w="740" w:type="dxa"/>
             <w:gridSpan w:val="3"/>
             <w:tcBorders>
-              <w:top w:val="nil"/>
-              <w:left w:val="single" w:sz="8" w:space="0" w:color="auto"/>
-              <w:bottom w:val="single" w:sz="8" w:space="0" w:color="auto"/>
-              <w:right w:val="single" w:sz="8" w:space="0" w:color="auto"/>
-            </w:tcBorders>
-            <w:vAlign w:val="center"/>
-          </w:tcPr>
-          <w:p>
-            <w:pPr>
-              <w:jc w:val="center"/>
-            </w:pPr>
-            <w:r>
-              <w:rPr>
-                <w:rFonts w:ascii="Times New Roman" w:hAnsi="Times New Roman"/>
-                <w:color w:val="000000" w:themeColor="text1"/>
-                <w:sz w:val="14"/>
-                <w:szCs w:val="14"/>
-              </w:rPr>
-              <w:t>Week (Before Testing Date)</w:t>
+              <w:top w:val="single" w:sz="8" w:space="0" w:color="auto"/>
+              <w:left w:val="single" w:sz="8" w:space="0" w:color="auto"/>
+              <w:bottom w:val="single" w:sz="8" w:space="0" w:color="auto"/>
+              <w:right w:val="single" w:sz="8" w:space="0" w:color="auto"/>
+            </w:tcBorders>
+            <w:vAlign w:val="center"/>
+          </w:tcPr>
+          <w:p>
+            <w:pPr>
+              <w:jc w:val="center"/>
+            </w:pPr>
+            <w:r>
+              <w:rPr>
+                <w:rFonts w:ascii="Times New Roman" w:hAnsi="Times New Roman"/>
+                <w:color w:val="000000" w:themeColor="text1"/>
+                <w:sz w:val="14"/>
+                <w:szCs w:val="14"/>
+              </w:rPr>
+              <w:t>Week on Testing Date</w:t>
             </w:r>
           </w:p>
         </w:tc>
@@ -5526,7 +5521,7 @@
           <w:tcPr>
             <w:tcW w:w="1415" w:type="dxa"/>
             <w:tcBorders>
-              <w:top w:val="nil"/>
+              <w:top w:val="single" w:sz="8" w:space="0" w:color="auto"/>
               <w:left w:val="nil"/>
               <w:bottom w:val="single" w:sz="8" w:space="0" w:color="auto"/>
               <w:right w:val="single" w:sz="8" w:space="0" w:color="auto"/>
@@ -5577,7 +5572,7 @@
           <w:tcPr>
             <w:tcW w:w="1413" w:type="dxa"/>
             <w:tcBorders>
-              <w:top w:val="nil"/>
+              <w:top w:val="single" w:sz="8" w:space="0" w:color="auto"/>
               <w:left w:val="single" w:sz="8" w:space="0" w:color="auto"/>
               <w:bottom w:val="single" w:sz="8" w:space="0" w:color="auto"/>
               <w:right w:val="single" w:sz="8" w:space="0" w:color="auto"/>
@@ -5629,7 +5624,7 @@
             <w:tcW w:w="1366" w:type="dxa"/>
             <w:gridSpan w:val="2"/>
             <w:tcBorders>
-              <w:top w:val="nil"/>
+              <w:top w:val="single" w:sz="8" w:space="0" w:color="auto"/>
               <w:left w:val="single" w:sz="8" w:space="0" w:color="auto"/>
               <w:bottom w:val="single" w:sz="8" w:space="0" w:color="auto"/>
               <w:right w:val="single" w:sz="8" w:space="0" w:color="auto"/>
@@ -5680,29 +5675,29 @@
           <w:tcPr>
             <w:tcW w:w="800" w:type="dxa"/>
             <w:tcBorders>
-              <w:top w:val="nil"/>
+              <w:top w:val="single" w:sz="8" w:space="0" w:color="auto"/>
               <w:left w:val="nil"/>
               <w:bottom w:val="single" w:sz="8" w:space="0" w:color="auto"/>
-              <w:right w:val="single" w:sz="8" w:space="0" w:color="000000" w:themeColor="text1"/>
-            </w:tcBorders>
-            <w:vAlign w:val="center"/>
-          </w:tcPr>
-          <w:p>
-            <w:pPr>
-              <w:jc w:val="center"/>
-              <w:rPr>
-                <w:rFonts w:ascii="Times New Roman" w:hAnsi="Times New Roman"/>
-                <w:sz w:val="14"/>
-                <w:szCs w:val="14"/>
-              </w:rPr>
-            </w:pPr>
-            <w:r>
-              <w:rPr>
-                <w:rFonts w:ascii="Times New Roman" w:hAnsi="Times New Roman"/>
-                <w:sz w:val="14"/>
-                <w:szCs w:val="14"/>
-              </w:rPr>
-              <w:t xml:space="preserve"> None</w:t>
+              <w:right w:val="single" w:sz="8" w:space="0" w:color="auto"/>
+            </w:tcBorders>
+            <w:vAlign w:val="center"/>
+          </w:tcPr>
+          <w:p>
+            <w:pPr>
+              <w:jc w:val="center"/>
+              <w:rPr>
+                <w:rFonts w:ascii="Times New Roman" w:hAnsi="Times New Roman"/>
+                <w:sz w:val="14"/>
+                <w:szCs w:val="14"/>
+              </w:rPr>
+            </w:pPr>
+            <w:r>
+              <w:rPr>
+                <w:rFonts w:ascii="Times New Roman" w:hAnsi="Times New Roman"/>
+                <w:sz w:val="14"/>
+                <w:szCs w:val="14"/>
+              </w:rPr>
+              <w:t xml:space="preserve">None </w:t>
             </w:r>
           </w:p>
         </w:tc>
@@ -5713,352 +5708,6 @@
         </w:trPr>
         <w:tc>
           <w:tcPr>
-            <w:tcW w:w="1386" w:type="dxa"/>
-            <w:gridSpan w:val="2"/>
-            <w:tcBorders>
-              <w:top w:val="single" w:sz="8" w:space="0" w:color="auto"/>
-              <w:left w:val="single" w:sz="8" w:space="0" w:color="auto"/>
-              <w:bottom w:val="single" w:sz="8" w:space="0" w:color="auto"/>
-              <w:right w:val="single" w:sz="8" w:space="0" w:color="auto"/>
-            </w:tcBorders>
-            <w:vAlign w:val="center"/>
-          </w:tcPr>
-          <w:p>
-            <w:pPr>
-              <w:jc w:val="center"/>
-            </w:pPr>
-            <w:r>
-              <w:rPr>
-                <w:rFonts w:ascii="Times New Roman" w:hAnsi="Times New Roman"/>
-                <w:color w:val="000000" w:themeColor="text1"/>
-                <w:sz w:val="14"/>
-                <w:szCs w:val="14"/>
-              </w:rPr>
-              <w:t>Active Air Sampling of Cleanrooms</w:t>
-            </w:r>
-          </w:p>
-        </w:tc>
-        <w:tc>
-          <w:tcPr>
-            <w:tcW w:w="652" w:type="dxa"/>
-            <w:tcBorders>
-              <w:top w:val="single" w:sz="8" w:space="0" w:color="auto"/>
-              <w:left w:val="nil"/>
-              <w:bottom w:val="single" w:sz="8" w:space="0" w:color="auto"/>
-              <w:right w:val="single" w:sz="8" w:space="0" w:color="auto"/>
-            </w:tcBorders>
-            <w:vAlign w:val="center"/>
-          </w:tcPr>
-          <w:p>
-            <w:pPr>
-              <w:jc w:val="center"/>
-            </w:pPr>
-            <w:r>
-              <w:rPr>
-                <w:rFonts w:ascii="Times New Roman" w:hAnsi="Times New Roman"/>
-                <w:color w:val="000000" w:themeColor="text1"/>
-                <w:sz w:val="14"/>
-                <w:szCs w:val="14"/>
-              </w:rPr>
-              <w:t>Weekly</w:t>
-            </w:r>
-          </w:p>
-        </w:tc>
-        <w:tc>
-          <w:tcPr>
-            <w:tcW w:w="1129" w:type="dxa"/>
-            <w:tcBorders>
-              <w:top w:val="single" w:sz="8" w:space="0" w:color="auto"/>
-              <w:left w:val="single" w:sz="8" w:space="0" w:color="auto"/>
-              <w:bottom w:val="single" w:sz="8" w:space="0" w:color="auto"/>
-              <w:right w:val="single" w:sz="8" w:space="0" w:color="auto"/>
-            </w:tcBorders>
-            <w:vAlign w:val="center"/>
-          </w:tcPr>
-          <w:p>
-            <w:pPr>
-              <w:jc w:val="center"/>
-              <w:rPr>
-                <w:rFonts w:ascii="Times New Roman" w:hAnsi="Times New Roman"/>
-                <w:color w:val="000000" w:themeColor="text1"/>
-                <w:sz w:val="14"/>
-                <w:szCs w:val="14"/>
-              </w:rPr>
-            </w:pPr>
-            <w:r>
-              <w:rPr>
-                <w:rFonts w:ascii="Times New Roman" w:hAnsi="Times New Roman"/>
-                <w:color w:val="000000" w:themeColor="text1"/>
-                <w:sz w:val="14"/>
-                <w:szCs w:val="14"/>
-              </w:rPr>
-              <w:t xml:space="preserve">{{ </w:t>
-            </w:r>
-            <w:proofErr w:type="spellStart"/>
-            <w:r>
-              <w:rPr>
-                <w:rFonts w:ascii="Times New Roman" w:hAnsi="Times New Roman"/>
-                <w:color w:val="000000" w:themeColor="text1"/>
-                <w:sz w:val="14"/>
-                <w:szCs w:val="14"/>
-              </w:rPr>
-              <w:t>date_of_weekly</w:t>
-            </w:r>
-            <w:proofErr w:type="spellEnd"/>
-            <w:r>
-              <w:rPr>
-                <w:rFonts w:ascii="Times New Roman" w:hAnsi="Times New Roman"/>
-                <w:color w:val="000000" w:themeColor="text1"/>
-                <w:sz w:val="14"/>
-                <w:szCs w:val="14"/>
-              </w:rPr>
-              <w:t xml:space="preserve"> }}</w:t>
-            </w:r>
-          </w:p>
-        </w:tc>
-        <w:tc>
-          <w:tcPr>
-            <w:tcW w:w="999" w:type="dxa"/>
-            <w:tcBorders>
-              <w:top w:val="single" w:sz="8" w:space="0" w:color="auto"/>
-              <w:left w:val="single" w:sz="8" w:space="0" w:color="auto"/>
-              <w:bottom w:val="single" w:sz="8" w:space="0" w:color="auto"/>
-              <w:right w:val="single" w:sz="8" w:space="0" w:color="auto"/>
-            </w:tcBorders>
-            <w:vAlign w:val="center"/>
-          </w:tcPr>
-          <w:p>
-            <w:pPr>
-              <w:jc w:val="center"/>
-            </w:pPr>
-            <w:r>
-              <w:rPr>
-                <w:rFonts w:ascii="Times New Roman" w:hAnsi="Times New Roman"/>
-                <w:sz w:val="14"/>
-                <w:szCs w:val="14"/>
-              </w:rPr>
-              <w:t xml:space="preserve"> SMO</w:t>
-            </w:r>
-          </w:p>
-        </w:tc>
-        <w:tc>
-          <w:tcPr>
-            <w:tcW w:w="740" w:type="dxa"/>
-            <w:gridSpan w:val="3"/>
-            <w:tcBorders>
-              <w:top w:val="single" w:sz="8" w:space="0" w:color="auto"/>
-              <w:left w:val="single" w:sz="8" w:space="0" w:color="auto"/>
-              <w:bottom w:val="single" w:sz="8" w:space="0" w:color="auto"/>
-              <w:right w:val="single" w:sz="8" w:space="0" w:color="auto"/>
-            </w:tcBorders>
-            <w:vAlign w:val="center"/>
-          </w:tcPr>
-          <w:p>
-            <w:pPr>
-              <w:jc w:val="center"/>
-            </w:pPr>
-            <w:r>
-              <w:rPr>
-                <w:rFonts w:ascii="Times New Roman" w:hAnsi="Times New Roman"/>
-                <w:color w:val="000000" w:themeColor="text1"/>
-                <w:sz w:val="14"/>
-                <w:szCs w:val="14"/>
-              </w:rPr>
-              <w:t>Week (On or After Testing Date)</w:t>
-            </w:r>
-          </w:p>
-        </w:tc>
-        <w:tc>
-          <w:tcPr>
-            <w:tcW w:w="1415" w:type="dxa"/>
-            <w:tcBorders>
-              <w:top w:val="single" w:sz="8" w:space="0" w:color="auto"/>
-              <w:left w:val="nil"/>
-              <w:bottom w:val="single" w:sz="8" w:space="0" w:color="auto"/>
-              <w:right w:val="single" w:sz="8" w:space="0" w:color="auto"/>
-            </w:tcBorders>
-            <w:vAlign w:val="center"/>
-          </w:tcPr>
-          <w:p>
-            <w:pPr>
-              <w:jc w:val="center"/>
-              <w:rPr>
-                <w:rFonts w:ascii="Times New Roman" w:hAnsi="Times New Roman"/>
-                <w:sz w:val="14"/>
-                <w:szCs w:val="14"/>
-              </w:rPr>
-            </w:pPr>
-            <w:r>
-              <w:rPr>
-                <w:rFonts w:ascii="Times New Roman" w:hAnsi="Times New Roman"/>
-                <w:color w:val="000000" w:themeColor="text1"/>
-                <w:sz w:val="14"/>
-                <w:szCs w:val="14"/>
-              </w:rPr>
-              <w:t xml:space="preserve">{{ </w:t>
-            </w:r>
-            <w:proofErr w:type="spellStart"/>
-            <w:r>
-              <w:rPr>
-                <w:rFonts w:ascii="Times New Roman" w:hAnsi="Times New Roman"/>
-                <w:color w:val="000000" w:themeColor="text1"/>
-                <w:sz w:val="14"/>
-                <w:szCs w:val="14"/>
-              </w:rPr>
-              <w:t>obs_air_wk_of</w:t>
-            </w:r>
-            <w:proofErr w:type="spellEnd"/>
-            <w:r>
-              <w:rPr>
-                <w:rFonts w:ascii="Times New Roman" w:hAnsi="Times New Roman"/>
-                <w:color w:val="000000" w:themeColor="text1"/>
-                <w:sz w:val="14"/>
-                <w:szCs w:val="14"/>
-              </w:rPr>
-              <w:t xml:space="preserve"> }}</w:t>
-            </w:r>
-          </w:p>
-        </w:tc>
-        <w:tc>
-          <w:tcPr>
-            <w:tcW w:w="1413" w:type="dxa"/>
-            <w:tcBorders>
-              <w:top w:val="single" w:sz="8" w:space="0" w:color="auto"/>
-              <w:left w:val="single" w:sz="8" w:space="0" w:color="auto"/>
-              <w:bottom w:val="single" w:sz="8" w:space="0" w:color="auto"/>
-              <w:right w:val="single" w:sz="8" w:space="0" w:color="auto"/>
-            </w:tcBorders>
-            <w:vAlign w:val="center"/>
-          </w:tcPr>
-          <w:p>
-            <w:pPr>
-              <w:jc w:val="center"/>
-              <w:rPr>
-                <w:rFonts w:ascii="Times New Roman" w:hAnsi="Times New Roman"/>
-                <w:sz w:val="14"/>
-                <w:szCs w:val="14"/>
-              </w:rPr>
-            </w:pPr>
-            <w:r>
-              <w:rPr>
-                <w:rFonts w:ascii="Times New Roman" w:hAnsi="Times New Roman"/>
-                <w:color w:val="000000" w:themeColor="text1"/>
-                <w:sz w:val="14"/>
-                <w:szCs w:val="14"/>
-              </w:rPr>
-              <w:t xml:space="preserve">{{ </w:t>
-            </w:r>
-            <w:proofErr w:type="spellStart"/>
-            <w:r>
-              <w:rPr>
-                <w:rFonts w:ascii="Times New Roman" w:hAnsi="Times New Roman"/>
-                <w:color w:val="000000" w:themeColor="text1"/>
-                <w:sz w:val="14"/>
-                <w:szCs w:val="14"/>
-              </w:rPr>
-              <w:t>etx_air_wk_of</w:t>
-            </w:r>
-            <w:proofErr w:type="spellEnd"/>
-            <w:r>
-              <w:rPr>
-                <w:rFonts w:ascii="Times New Roman" w:hAnsi="Times New Roman"/>
-                <w:color w:val="000000" w:themeColor="text1"/>
-                <w:sz w:val="14"/>
-                <w:szCs w:val="14"/>
-              </w:rPr>
-              <w:t xml:space="preserve"> }}</w:t>
-            </w:r>
-          </w:p>
-        </w:tc>
-        <w:tc>
-          <w:tcPr>
-            <w:tcW w:w="1366" w:type="dxa"/>
-            <w:gridSpan w:val="2"/>
-            <w:tcBorders>
-              <w:top w:val="single" w:sz="8" w:space="0" w:color="auto"/>
-              <w:left w:val="single" w:sz="8" w:space="0" w:color="auto"/>
-              <w:bottom w:val="single" w:sz="8" w:space="0" w:color="auto"/>
-              <w:right w:val="single" w:sz="8" w:space="0" w:color="auto"/>
-            </w:tcBorders>
-            <w:vAlign w:val="center"/>
-          </w:tcPr>
-          <w:p>
-            <w:pPr>
-              <w:jc w:val="center"/>
-              <w:rPr>
-                <w:rFonts w:ascii="Times New Roman" w:hAnsi="Times New Roman"/>
-                <w:sz w:val="14"/>
-                <w:szCs w:val="14"/>
-              </w:rPr>
-            </w:pPr>
-            <w:r>
-              <w:rPr>
-                <w:rFonts w:ascii="Times New Roman" w:hAnsi="Times New Roman"/>
-                <w:color w:val="000000" w:themeColor="text1"/>
-                <w:sz w:val="14"/>
-                <w:szCs w:val="14"/>
-              </w:rPr>
-              <w:t xml:space="preserve">{{ </w:t>
-            </w:r>
-            <w:proofErr w:type="spellStart"/>
-            <w:r>
-              <w:rPr>
-                <w:rFonts w:ascii="Times New Roman" w:hAnsi="Times New Roman"/>
-                <w:color w:val="000000" w:themeColor="text1"/>
-                <w:sz w:val="14"/>
-                <w:szCs w:val="14"/>
-              </w:rPr>
-              <w:t>id_air_wk_of</w:t>
-            </w:r>
-            <w:proofErr w:type="spellEnd"/>
-            <w:r>
-              <w:rPr>
-                <w:rFonts w:ascii="Times New Roman" w:hAnsi="Times New Roman"/>
-                <w:color w:val="000000" w:themeColor="text1"/>
-                <w:sz w:val="14"/>
-                <w:szCs w:val="14"/>
-              </w:rPr>
-              <w:t xml:space="preserve"> }}</w:t>
-            </w:r>
-          </w:p>
-        </w:tc>
-        <w:tc>
-          <w:tcPr>
-            <w:tcW w:w="800" w:type="dxa"/>
-            <w:tcBorders>
-              <w:top w:val="single" w:sz="8" w:space="0" w:color="auto"/>
-              <w:left w:val="nil"/>
-              <w:bottom w:val="single" w:sz="8" w:space="0" w:color="auto"/>
-              <w:right w:val="single" w:sz="8" w:space="0" w:color="auto"/>
-            </w:tcBorders>
-            <w:vAlign w:val="center"/>
-          </w:tcPr>
-          <w:p>
-            <w:pPr>
-              <w:jc w:val="center"/>
-              <w:rPr>
-                <w:rFonts w:ascii="Times New Roman" w:hAnsi="Times New Roman"/>
-                <w:sz w:val="14"/>
-                <w:szCs w:val="14"/>
-              </w:rPr>
-            </w:pPr>
-            <w:r>
-              <w:rPr>
-                <w:rFonts w:ascii="Times New Roman" w:hAnsi="Times New Roman"/>
-                <w:sz w:val="14"/>
-                <w:szCs w:val="14"/>
-              </w:rPr>
-              <w:t xml:space="preserve">None </w:t>
-            </w:r>
-          </w:p>
-        </w:tc>
-      </w:tr>
-      <w:tr>
-        <w:trPr>
-          <w:trHeight w:val="300"/>
-        </w:trPr>
-        <w:tc>
-          <w:tcPr>
             <w:tcW w:w="9900" w:type="dxa"/>
             <w:gridSpan w:val="13"/>
             <w:tcBorders>
@@ -6081,337 +5730,6 @@
                 <w:szCs w:val="14"/>
               </w:rPr>
               <w:t xml:space="preserve">   Surface Sampling of Anteroom and Cleanroom Bracketing </w:t>
-            </w:r>
-          </w:p>
-        </w:tc>
-      </w:tr>
-      <w:tr>
-        <w:trPr>
-          <w:trHeight w:val="300"/>
-        </w:trPr>
-        <w:tc>
-          <w:tcPr>
-            <w:tcW w:w="1386" w:type="dxa"/>
-            <w:gridSpan w:val="2"/>
-            <w:tcBorders>
-              <w:top w:val="single" w:sz="8" w:space="0" w:color="auto"/>
-              <w:left w:val="single" w:sz="8" w:space="0" w:color="auto"/>
-              <w:bottom w:val="single" w:sz="8" w:space="0" w:color="auto"/>
-              <w:right w:val="single" w:sz="8" w:space="0" w:color="000000" w:themeColor="text1"/>
-            </w:tcBorders>
-            <w:vAlign w:val="center"/>
-          </w:tcPr>
-          <w:p>
-            <w:pPr>
-              <w:jc w:val="center"/>
-            </w:pPr>
-            <w:r>
-              <w:rPr>
-                <w:rFonts w:ascii="Times New Roman" w:hAnsi="Times New Roman"/>
-                <w:color w:val="000000" w:themeColor="text1"/>
-                <w:sz w:val="14"/>
-                <w:szCs w:val="14"/>
-              </w:rPr>
-              <w:t>Surface Sampling of Cleanrooms</w:t>
-            </w:r>
-          </w:p>
-        </w:tc>
-        <w:tc>
-          <w:tcPr>
-            <w:tcW w:w="652" w:type="dxa"/>
-            <w:tcBorders>
-              <w:top w:val="nil"/>
-              <w:left w:val="nil"/>
-              <w:bottom w:val="single" w:sz="8" w:space="0" w:color="auto"/>
-              <w:right w:val="single" w:sz="8" w:space="0" w:color="auto"/>
-            </w:tcBorders>
-            <w:vAlign w:val="center"/>
-          </w:tcPr>
-          <w:p>
-            <w:pPr>
-              <w:jc w:val="center"/>
-            </w:pPr>
-            <w:r>
-              <w:rPr>
-                <w:rFonts w:ascii="Times New Roman" w:hAnsi="Times New Roman"/>
-                <w:color w:val="000000" w:themeColor="text1"/>
-                <w:sz w:val="14"/>
-                <w:szCs w:val="14"/>
-              </w:rPr>
-              <w:t>Weekly</w:t>
-            </w:r>
-          </w:p>
-        </w:tc>
-        <w:tc>
-          <w:tcPr>
-            <w:tcW w:w="1129" w:type="dxa"/>
-            <w:tcBorders>
-              <w:top w:val="nil"/>
-              <w:left w:val="single" w:sz="8" w:space="0" w:color="auto"/>
-              <w:bottom w:val="single" w:sz="8" w:space="0" w:color="auto"/>
-              <w:right w:val="single" w:sz="8" w:space="0" w:color="auto"/>
-            </w:tcBorders>
-            <w:vAlign w:val="center"/>
-          </w:tcPr>
-          <w:p>
-            <w:pPr>
-              <w:jc w:val="center"/>
-              <w:rPr>
-                <w:rFonts w:ascii="Times New Roman" w:hAnsi="Times New Roman"/>
-                <w:color w:val="000000" w:themeColor="text1"/>
-                <w:sz w:val="14"/>
-                <w:szCs w:val="14"/>
-              </w:rPr>
-            </w:pPr>
-            <w:r>
-              <w:rPr>
-                <w:rFonts w:ascii="Times New Roman" w:hAnsi="Times New Roman"/>
-                <w:color w:val="000000" w:themeColor="text1"/>
-                <w:sz w:val="14"/>
-                <w:szCs w:val="14"/>
-              </w:rPr>
-              <w:t xml:space="preserve">{{ date_of_weekly }} </w:t>
-            </w:r>
-          </w:p>
-        </w:tc>
-        <w:tc>
-          <w:tcPr>
-            <w:tcW w:w="999" w:type="dxa"/>
-            <w:tcBorders>
-              <w:top w:val="nil"/>
-              <w:left w:val="single" w:sz="8" w:space="0" w:color="auto"/>
-              <w:bottom w:val="single" w:sz="8" w:space="0" w:color="auto"/>
-              <w:right w:val="single" w:sz="8" w:space="0" w:color="auto"/>
-            </w:tcBorders>
-            <w:vAlign w:val="center"/>
-          </w:tcPr>
-          <w:p>
-            <w:pPr>
-              <w:jc w:val="center"/>
-              <w:rPr>
-                <w:rFonts w:ascii="Times New Roman" w:hAnsi="Times New Roman"/>
-                <w:sz w:val="14"/>
-                <w:szCs w:val="14"/>
-              </w:rPr>
-            </w:pPr>
-            <w:r>
-              <w:rPr>
-                <w:rFonts w:ascii="Times New Roman" w:hAnsi="Times New Roman"/>
-                <w:sz w:val="14"/>
-                <w:szCs w:val="14"/>
-              </w:rPr>
-              <w:t xml:space="preserve">SMO </w:t>
-            </w:r>
-          </w:p>
-        </w:tc>
-        <w:tc>
-          <w:tcPr>
-            <w:tcW w:w="740" w:type="dxa"/>
-            <w:gridSpan w:val="3"/>
-            <w:tcBorders>
-              <w:top w:val="nil"/>
-              <w:left w:val="single" w:sz="8" w:space="0" w:color="auto"/>
-              <w:bottom w:val="single" w:sz="8" w:space="0" w:color="auto"/>
-              <w:right w:val="single" w:sz="8" w:space="0" w:color="auto"/>
-            </w:tcBorders>
-            <w:vAlign w:val="center"/>
-          </w:tcPr>
-          <w:p>
-            <w:pPr>
-              <w:jc w:val="center"/>
-            </w:pPr>
-            <w:r>
-              <w:rPr>
-                <w:rFonts w:ascii="Times New Roman" w:hAnsi="Times New Roman"/>
-                <w:color w:val="000000" w:themeColor="text1"/>
-                <w:sz w:val="14"/>
-                <w:szCs w:val="14"/>
-              </w:rPr>
-              <w:t>Week (Before Testing Date)</w:t>
-            </w:r>
-          </w:p>
-        </w:tc>
-        <w:tc>
-          <w:tcPr>
-            <w:tcW w:w="1415" w:type="dxa"/>
-            <w:tcBorders>
-              <w:top w:val="nil"/>
-              <w:left w:val="nil"/>
-              <w:bottom w:val="single" w:sz="8" w:space="0" w:color="auto"/>
-              <w:right w:val="single" w:sz="8" w:space="0" w:color="auto"/>
-            </w:tcBorders>
-            <w:vAlign w:val="center"/>
-          </w:tcPr>
-          <w:p>
-            <w:pPr>
-              <w:jc w:val="center"/>
-              <w:rPr>
-                <w:rFonts w:ascii="Times New Roman" w:hAnsi="Times New Roman"/>
-                <w:sz w:val="14"/>
-                <w:szCs w:val="14"/>
-              </w:rPr>
-            </w:pPr>
-            <w:r>
-              <w:rPr>
-                <w:rFonts w:ascii="Times New Roman" w:hAnsi="Times New Roman"/>
-                <w:color w:val="000000" w:themeColor="text1"/>
-                <w:sz w:val="14"/>
-                <w:szCs w:val="14"/>
-              </w:rPr>
-              <w:t xml:space="preserve">{{ </w:t>
-            </w:r>
-            <w:proofErr w:type="spellStart"/>
-            <w:r>
-              <w:rPr>
-                <w:rFonts w:ascii="Times New Roman" w:hAnsi="Times New Roman"/>
-                <w:color w:val="000000" w:themeColor="text1"/>
-                <w:sz w:val="14"/>
-                <w:szCs w:val="14"/>
-              </w:rPr>
-              <w:t>obs_room_wk_of</w:t>
-            </w:r>
-            <w:proofErr w:type="spellEnd"/>
-            <w:r>
-              <w:rPr>
-                <w:rFonts w:ascii="Times New Roman" w:hAnsi="Times New Roman"/>
-                <w:color w:val="000000" w:themeColor="text1"/>
-                <w:sz w:val="14"/>
-                <w:szCs w:val="14"/>
-              </w:rPr>
-              <w:t xml:space="preserve"> }}</w:t>
-            </w:r>
-          </w:p>
-        </w:tc>
-        <w:tc>
-          <w:tcPr>
-            <w:tcW w:w="1413" w:type="dxa"/>
-            <w:tcBorders>
-              <w:top w:val="nil"/>
-              <w:left w:val="single" w:sz="8" w:space="0" w:color="auto"/>
-              <w:bottom w:val="single" w:sz="8" w:space="0" w:color="auto"/>
-              <w:right w:val="single" w:sz="8" w:space="0" w:color="auto"/>
-            </w:tcBorders>
-            <w:vAlign w:val="center"/>
-          </w:tcPr>
-          <w:p>
-            <w:pPr>
-              <w:jc w:val="center"/>
-              <w:rPr>
-                <w:rFonts w:ascii="Times New Roman" w:hAnsi="Times New Roman"/>
-                <w:sz w:val="14"/>
-                <w:szCs w:val="14"/>
-              </w:rPr>
-            </w:pPr>
-            <w:r>
-              <w:rPr>
-                <w:rFonts w:ascii="Times New Roman" w:hAnsi="Times New Roman"/>
-                <w:color w:val="000000" w:themeColor="text1"/>
-                <w:sz w:val="14"/>
-                <w:szCs w:val="14"/>
-              </w:rPr>
-              <w:t xml:space="preserve">{{ </w:t>
-            </w:r>
-            <w:proofErr w:type="spellStart"/>
-            <w:r>
-              <w:rPr>
-                <w:rFonts w:ascii="Times New Roman" w:hAnsi="Times New Roman"/>
-                <w:color w:val="000000" w:themeColor="text1"/>
-                <w:sz w:val="14"/>
-                <w:szCs w:val="14"/>
-              </w:rPr>
-              <w:t>etx_room_wk_of</w:t>
-            </w:r>
-            <w:proofErr w:type="spellEnd"/>
-            <w:r>
-              <w:rPr>
-                <w:rFonts w:ascii="Times New Roman" w:hAnsi="Times New Roman"/>
-                <w:color w:val="000000" w:themeColor="text1"/>
-                <w:sz w:val="14"/>
-                <w:szCs w:val="14"/>
-              </w:rPr>
-              <w:t xml:space="preserve"> }}</w:t>
-            </w:r>
-          </w:p>
-        </w:tc>
-        <w:tc>
-          <w:tcPr>
-            <w:tcW w:w="1366" w:type="dxa"/>
-            <w:gridSpan w:val="2"/>
-            <w:tcBorders>
-              <w:top w:val="nil"/>
-              <w:left w:val="single" w:sz="8" w:space="0" w:color="auto"/>
-              <w:bottom w:val="single" w:sz="8" w:space="0" w:color="auto"/>
-              <w:right w:val="single" w:sz="8" w:space="0" w:color="auto"/>
-            </w:tcBorders>
-            <w:vAlign w:val="center"/>
-          </w:tcPr>
-          <w:p>
-            <w:pPr>
-              <w:jc w:val="center"/>
-              <w:rPr>
-                <w:rFonts w:ascii="Times New Roman" w:hAnsi="Times New Roman"/>
-                <w:sz w:val="14"/>
-                <w:szCs w:val="14"/>
-              </w:rPr>
-            </w:pPr>
-            <w:r>
-              <w:rPr>
-                <w:rFonts w:ascii="Times New Roman" w:hAnsi="Times New Roman"/>
-                <w:color w:val="000000" w:themeColor="text1"/>
-                <w:sz w:val="14"/>
-                <w:szCs w:val="14"/>
-              </w:rPr>
-              <w:t xml:space="preserve">{{ </w:t>
-            </w:r>
-            <w:proofErr w:type="spellStart"/>
-            <w:r>
-              <w:rPr>
-                <w:rFonts w:ascii="Times New Roman" w:hAnsi="Times New Roman"/>
-                <w:color w:val="000000" w:themeColor="text1"/>
-                <w:sz w:val="14"/>
-                <w:szCs w:val="14"/>
-              </w:rPr>
-              <w:t>id_room_wk_of</w:t>
-            </w:r>
-            <w:proofErr w:type="spellEnd"/>
-            <w:r>
-              <w:rPr>
-                <w:rFonts w:ascii="Times New Roman" w:hAnsi="Times New Roman"/>
-                <w:color w:val="000000" w:themeColor="text1"/>
-                <w:sz w:val="14"/>
-                <w:szCs w:val="14"/>
-              </w:rPr>
-              <w:t xml:space="preserve"> }}</w:t>
-            </w:r>
-          </w:p>
-        </w:tc>
-        <w:tc>
-          <w:tcPr>
-            <w:tcW w:w="800" w:type="dxa"/>
-            <w:tcBorders>
-              <w:top w:val="nil"/>
-              <w:left w:val="nil"/>
-              <w:bottom w:val="single" w:sz="8" w:space="0" w:color="auto"/>
-              <w:right w:val="single" w:sz="8" w:space="0" w:color="000000" w:themeColor="text1"/>
-            </w:tcBorders>
-            <w:vAlign w:val="center"/>
-          </w:tcPr>
-          <w:p>
-            <w:pPr>
-              <w:jc w:val="center"/>
-              <w:rPr>
-                <w:rFonts w:ascii="Times New Roman" w:hAnsi="Times New Roman"/>
-                <w:sz w:val="14"/>
-                <w:szCs w:val="14"/>
-              </w:rPr>
-            </w:pPr>
-            <w:r>
-              <w:rPr>
-                <w:rFonts w:ascii="Times New Roman" w:hAnsi="Times New Roman"/>
-                <w:sz w:val="14"/>
-                <w:szCs w:val="14"/>
-              </w:rPr>
-              <w:t xml:space="preserve">None </w:t>
             </w:r>
           </w:p>
         </w:tc>
@@ -6553,7 +5871,7 @@
                 <w:sz w:val="14"/>
                 <w:szCs w:val="14"/>
               </w:rPr>
-              <w:t>Week (On or After Testing Date)</w:t>
+              <w:t>Week on Testing Date</w:t>
             </w:r>
           </w:p>
         </w:tc>

</xml_diff>